<commit_message>
Atualiza algoritmo de hash do formulário para SHA-512.
Alinha o item 7 à recomendação do INPI/comentário da Julia.

Co-authored-by: Daniel Alves da Cunha <DanielAlvesDaCunha@users.noreply.github.com>
</commit_message>
<xml_diff>
--- a/Modelo_Formulario_Registro_Software_Connectn_Reiki_PREENCHIDO.docx
+++ b/Modelo_Formulario_Registro_Software_Connectn_Reiki_PREENCHIDO.docx
@@ -8311,7 +8311,7 @@
                                 <w:color w:val="000000"/>
                                 <w:sz w:val="20"/>
                               </w:rPr>
-                              <w:t>SHA-256</w:t>
+                              <w:t>SHA-512</w:t>
                             </w:r>
                           </w:p>
                         </w:txbxContent>
@@ -8349,7 +8349,7 @@
                           <w:color w:val="000000"/>
                           <w:sz w:val="20"/>
                         </w:rPr>
-                        <w:t>SHA-256</w:t>
+                        <w:t>SHA-512</w:t>
                       </w:r>
                     </w:p>
                   </w:txbxContent>

</xml_diff>